<commit_message>
Added final components in FAQ page. Fixed issues with weather widget.
</commit_message>
<xml_diff>
--- a/Midterm_Report_Mantzaridis.docx
+++ b/Midterm_Report_Mantzaridis.docx
@@ -89,22 +89,8 @@
         <w:rPr>
           <w:rFonts w:ascii="Times New Roman" w:hAnsi="Times New Roman" w:cs="Times New Roman"/>
         </w:rPr>
-        <w:t xml:space="preserve">Prof. </w:t>
-      </w:r>
-      <w:r>
-        <w:rPr>
-          <w:rFonts w:ascii="Times New Roman" w:hAnsi="Times New Roman" w:cs="Times New Roman"/>
-        </w:rPr>
-        <w:t xml:space="preserve">Leonardos </w:t>
-      </w:r>
-      <w:proofErr w:type="spellStart"/>
-      <w:r>
-        <w:rPr>
-          <w:rFonts w:ascii="Times New Roman" w:hAnsi="Times New Roman" w:cs="Times New Roman"/>
-        </w:rPr>
-        <w:t>Mageiros</w:t>
-      </w:r>
-      <w:proofErr w:type="spellEnd"/>
+        <w:t>Prof. Leonardos Mageiros</w:t>
+      </w:r>
     </w:p>
     <w:p>
       <w:pPr>
@@ -117,19 +103,7 @@
         <w:rPr>
           <w:rFonts w:ascii="Times New Roman" w:hAnsi="Times New Roman" w:cs="Times New Roman"/>
         </w:rPr>
-        <w:t>February 24</w:t>
-      </w:r>
-      <w:r>
-        <w:rPr>
-          <w:rFonts w:ascii="Times New Roman" w:hAnsi="Times New Roman" w:cs="Times New Roman"/>
-        </w:rPr>
-        <w:t>, 202</w:t>
-      </w:r>
-      <w:r>
-        <w:rPr>
-          <w:rFonts w:ascii="Times New Roman" w:hAnsi="Times New Roman" w:cs="Times New Roman"/>
-        </w:rPr>
-        <w:t>6</w:t>
+        <w:t>February 24, 2026</w:t>
       </w:r>
     </w:p>
     <w:p>
@@ -148,7 +122,12 @@
     <w:sdt>
       <w:sdtPr>
         <w:rPr>
-          <w:rFonts w:ascii="Times New Roman" w:hAnsi="Times New Roman" w:cs="Times New Roman"/>
+          <w:rFonts w:ascii="Times New Roman" w:eastAsiaTheme="minorHAnsi" w:hAnsi="Times New Roman" w:cs="Times New Roman"/>
+          <w:color w:val="auto"/>
+          <w:kern w:val="2"/>
+          <w:sz w:val="24"/>
+          <w:szCs w:val="24"/>
+          <w14:ligatures w14:val="standardContextual"/>
         </w:rPr>
         <w:id w:val="-8141530"/>
         <w:docPartObj>
@@ -158,15 +137,9 @@
       </w:sdtPr>
       <w:sdtEndPr>
         <w:rPr>
-          <w:rFonts w:eastAsiaTheme="minorHAnsi"/>
           <w:b/>
           <w:bCs/>
           <w:noProof/>
-          <w:color w:val="auto"/>
-          <w:kern w:val="2"/>
-          <w:sz w:val="24"/>
-          <w:szCs w:val="24"/>
-          <w14:ligatures w14:val="standardContextual"/>
         </w:rPr>
       </w:sdtEndPr>
       <w:sdtContent>
@@ -527,6 +500,10 @@
     <w:p>
       <w:pPr>
         <w:pStyle w:val="Heading1"/>
+        <w:numPr>
+          <w:ilvl w:val="0"/>
+          <w:numId w:val="1"/>
+        </w:numPr>
         <w:jc w:val="both"/>
         <w:rPr>
           <w:rFonts w:ascii="Times New Roman" w:hAnsi="Times New Roman" w:cs="Times New Roman"/>
@@ -596,91 +573,13 @@
         <w:rPr>
           <w:rFonts w:ascii="Times New Roman" w:hAnsi="Times New Roman" w:cs="Times New Roman"/>
         </w:rPr>
-        <w:t xml:space="preserve">and should be rendered in standard mode. Then the </w:t>
-      </w:r>
-      <w:r>
-        <w:rPr>
-          <w:rFonts w:ascii="Times New Roman" w:hAnsi="Times New Roman" w:cs="Times New Roman"/>
-        </w:rPr>
-        <w:t>lang="</w:t>
-      </w:r>
-      <w:proofErr w:type="spellStart"/>
-      <w:r>
-        <w:rPr>
-          <w:rFonts w:ascii="Times New Roman" w:hAnsi="Times New Roman" w:cs="Times New Roman"/>
-        </w:rPr>
-        <w:t>en</w:t>
-      </w:r>
-      <w:proofErr w:type="spellEnd"/>
-      <w:r>
-        <w:rPr>
-          <w:rFonts w:ascii="Times New Roman" w:hAnsi="Times New Roman" w:cs="Times New Roman"/>
-        </w:rPr>
-        <w:t>"</w:t>
-      </w:r>
-      <w:r>
-        <w:rPr>
-          <w:rFonts w:ascii="Times New Roman" w:hAnsi="Times New Roman" w:cs="Times New Roman"/>
-        </w:rPr>
-        <w:t xml:space="preserve"> is used to signal to the browser that the site is written in English. This helps with accessibility and translation purposes. </w:t>
-      </w:r>
-      <w:r>
-        <w:rPr>
-          <w:rFonts w:ascii="Times New Roman" w:hAnsi="Times New Roman" w:cs="Times New Roman"/>
-        </w:rPr>
-        <w:t xml:space="preserve">Next, </w:t>
-      </w:r>
-      <w:r>
-        <w:rPr>
-          <w:rFonts w:ascii="Times New Roman" w:hAnsi="Times New Roman" w:cs="Times New Roman"/>
-        </w:rPr>
-        <w:t xml:space="preserve">&lt;link </w:t>
-      </w:r>
-      <w:proofErr w:type="spellStart"/>
-      <w:r>
-        <w:rPr>
-          <w:rFonts w:ascii="Times New Roman" w:hAnsi="Times New Roman" w:cs="Times New Roman"/>
-        </w:rPr>
-        <w:t>rel</w:t>
-      </w:r>
-      <w:proofErr w:type="spellEnd"/>
-      <w:r>
-        <w:rPr>
-          <w:rFonts w:ascii="Times New Roman" w:hAnsi="Times New Roman" w:cs="Times New Roman"/>
-        </w:rPr>
-        <w:t xml:space="preserve">="stylesheet" </w:t>
-      </w:r>
-      <w:proofErr w:type="spellStart"/>
-      <w:r>
-        <w:rPr>
-          <w:rFonts w:ascii="Times New Roman" w:hAnsi="Times New Roman" w:cs="Times New Roman"/>
-        </w:rPr>
-        <w:t>href</w:t>
-      </w:r>
-      <w:proofErr w:type="spellEnd"/>
-      <w:r>
-        <w:rPr>
-          <w:rFonts w:ascii="Times New Roman" w:hAnsi="Times New Roman" w:cs="Times New Roman"/>
-        </w:rPr>
-        <w:t>="style.css"&gt;</w:t>
-      </w:r>
-      <w:r>
-        <w:rPr>
-          <w:rFonts w:ascii="Times New Roman" w:hAnsi="Times New Roman" w:cs="Times New Roman"/>
-        </w:rPr>
-        <w:t xml:space="preserve"> is used to connect the html file to the style.css files, which contains all the stylistic aspects of the webpage. After that, the </w:t>
-      </w:r>
-      <w:r>
-        <w:rPr>
-          <w:rFonts w:ascii="Times New Roman" w:hAnsi="Times New Roman" w:cs="Times New Roman"/>
-        </w:rPr>
-        <w:t>&lt;meta charset="UTF-8" /&gt;</w:t>
-      </w:r>
-      <w:r>
-        <w:rPr>
-          <w:rFonts w:ascii="Times New Roman" w:hAnsi="Times New Roman" w:cs="Times New Roman"/>
-        </w:rPr>
-        <w:t xml:space="preserve"> tag is used to indicate that the document’s characters should be interpreted using UTF-8. Lastly, before closing the head, all the relevant JavaScript files are linked using the “defer” keyword. </w:t>
+        <w:t xml:space="preserve">and should be rendered in standard mode. Then the lang="en" is used to signal to the browser that the site is written in English. This helps with accessibility and translation purposes. </w:t>
+      </w:r>
+      <w:r>
+        <w:rPr>
+          <w:rFonts w:ascii="Times New Roman" w:hAnsi="Times New Roman" w:cs="Times New Roman"/>
+        </w:rPr>
+        <w:t xml:space="preserve">Next, &lt;link rel="stylesheet" href="style.css"&gt; is used to connect the html file to the style.css files, which contains all the stylistic aspects of the webpage. After that, the &lt;meta charset="UTF-8" /&gt; tag is used to indicate that the document’s characters should be interpreted using UTF-8. Lastly, before closing the head, all the relevant JavaScript files are linked using the “defer” keyword. </w:t>
       </w:r>
     </w:p>
     <w:p>
@@ -695,19 +594,7 @@
         <w:rPr>
           <w:rFonts w:ascii="Times New Roman" w:hAnsi="Times New Roman" w:cs="Times New Roman"/>
         </w:rPr>
-        <w:t xml:space="preserve">The body starts with the </w:t>
-      </w:r>
-      <w:r>
-        <w:rPr>
-          <w:rFonts w:ascii="Times New Roman" w:hAnsi="Times New Roman" w:cs="Times New Roman"/>
-        </w:rPr>
-        <w:t>&lt;div id="header-placeholder"&gt;&lt;/div&gt;</w:t>
-      </w:r>
-      <w:r>
-        <w:rPr>
-          <w:rFonts w:ascii="Times New Roman" w:hAnsi="Times New Roman" w:cs="Times New Roman"/>
-        </w:rPr>
-        <w:t xml:space="preserve"> tag. This creates a </w:t>
+        <w:t xml:space="preserve">The body starts with the &lt;div id="header-placeholder"&gt;&lt;/div&gt; tag. This creates a </w:t>
       </w:r>
       <w:r>
         <w:rPr>
@@ -740,19 +627,7 @@
         <w:rPr>
           <w:rFonts w:ascii="Times New Roman" w:hAnsi="Times New Roman" w:cs="Times New Roman"/>
         </w:rPr>
-        <w:t xml:space="preserve">The first section has the </w:t>
-      </w:r>
-      <w:r>
-        <w:rPr>
-          <w:rFonts w:ascii="Times New Roman" w:hAnsi="Times New Roman" w:cs="Times New Roman"/>
-        </w:rPr>
-        <w:t>id="task-form"</w:t>
-      </w:r>
-      <w:r>
-        <w:rPr>
-          <w:rFonts w:ascii="Times New Roman" w:hAnsi="Times New Roman" w:cs="Times New Roman"/>
-        </w:rPr>
-        <w:t xml:space="preserve"> and contains all the task-related input boxes and menus. These include the task name, Description, due date, and priority. Lastly, the “Task Button” is used to submit all the inserted data to the server. </w:t>
+        <w:t xml:space="preserve">The first section has the id="task-form" and contains all the task-related input boxes and menus. These include the task name, Description, due date, and priority. Lastly, the “Task Button” is used to submit all the inserted data to the server. </w:t>
       </w:r>
     </w:p>
     <w:p>
@@ -862,35 +737,7 @@
         <w:rPr>
           <w:rFonts w:ascii="Times New Roman" w:hAnsi="Times New Roman" w:cs="Times New Roman"/>
         </w:rPr>
-        <w:t xml:space="preserve">This, </w:t>
-      </w:r>
-      <w:proofErr w:type="spellStart"/>
-      <w:r>
-        <w:rPr>
-          <w:rFonts w:ascii="Times New Roman" w:hAnsi="Times New Roman" w:cs="Times New Roman"/>
-        </w:rPr>
-        <w:t>JSON.parse</w:t>
-      </w:r>
-      <w:proofErr w:type="spellEnd"/>
-      <w:r>
-        <w:rPr>
-          <w:rFonts w:ascii="Times New Roman" w:hAnsi="Times New Roman" w:cs="Times New Roman"/>
-        </w:rPr>
-        <w:t xml:space="preserve">() is utilized to take the strings stored in </w:t>
-      </w:r>
-      <w:proofErr w:type="spellStart"/>
-      <w:r>
-        <w:rPr>
-          <w:rFonts w:ascii="Times New Roman" w:hAnsi="Times New Roman" w:cs="Times New Roman"/>
-        </w:rPr>
-        <w:t>localStorage</w:t>
-      </w:r>
-      <w:proofErr w:type="spellEnd"/>
-      <w:r>
-        <w:rPr>
-          <w:rFonts w:ascii="Times New Roman" w:hAnsi="Times New Roman" w:cs="Times New Roman"/>
-        </w:rPr>
-        <w:t xml:space="preserve"> and turn them into usable JavaScript objects. In this case, it creates arrays. At this point, we use the “let” keyword, as the arrays created may be later reassigned, sliced, or replaced, things that would not be possible if they were declared as constants. </w:t>
+        <w:t xml:space="preserve">This, JSON.parse() is utilized to take the strings stored in localStorage and turn them into usable JavaScript objects. In this case, it creates arrays. At this point, we use the “let” keyword, as the arrays created may be later reassigned, sliced, or replaced, things that would not be possible if they were declared as constants. </w:t>
       </w:r>
     </w:p>
     <w:p>
@@ -905,117 +752,19 @@
           <w:rFonts w:ascii="Times New Roman" w:hAnsi="Times New Roman" w:cs="Times New Roman"/>
         </w:rPr>
         <w:tab/>
-        <w:t xml:space="preserve">What follows is the declaration of functions. </w:t>
-      </w:r>
-      <w:proofErr w:type="spellStart"/>
-      <w:r>
-        <w:rPr>
-          <w:rFonts w:ascii="Times New Roman" w:hAnsi="Times New Roman" w:cs="Times New Roman"/>
-        </w:rPr>
-        <w:t>saveTasks</w:t>
-      </w:r>
-      <w:proofErr w:type="spellEnd"/>
-      <w:r>
-        <w:rPr>
-          <w:rFonts w:ascii="Times New Roman" w:hAnsi="Times New Roman" w:cs="Times New Roman"/>
-        </w:rPr>
-        <w:t xml:space="preserve">() converts the “tasks” array into a string that can be saved in the </w:t>
-      </w:r>
-      <w:proofErr w:type="spellStart"/>
-      <w:r>
-        <w:rPr>
-          <w:rFonts w:ascii="Times New Roman" w:hAnsi="Times New Roman" w:cs="Times New Roman"/>
-        </w:rPr>
-        <w:t>localStorage</w:t>
-      </w:r>
-      <w:proofErr w:type="spellEnd"/>
-      <w:r>
-        <w:rPr>
-          <w:rFonts w:ascii="Times New Roman" w:hAnsi="Times New Roman" w:cs="Times New Roman"/>
-        </w:rPr>
-        <w:t xml:space="preserve">. The </w:t>
-      </w:r>
-      <w:proofErr w:type="spellStart"/>
-      <w:r>
-        <w:rPr>
-          <w:rFonts w:ascii="Times New Roman" w:hAnsi="Times New Roman" w:cs="Times New Roman"/>
-        </w:rPr>
-        <w:t>saveActivity</w:t>
-      </w:r>
-      <w:proofErr w:type="spellEnd"/>
-      <w:r>
-        <w:rPr>
-          <w:rFonts w:ascii="Times New Roman" w:hAnsi="Times New Roman" w:cs="Times New Roman"/>
-        </w:rPr>
-        <w:t xml:space="preserve">() function works the same way, but also checks if the </w:t>
-      </w:r>
-      <w:proofErr w:type="spellStart"/>
-      <w:r>
-        <w:rPr>
-          <w:rFonts w:ascii="Times New Roman" w:hAnsi="Times New Roman" w:cs="Times New Roman"/>
-        </w:rPr>
-        <w:t>taskActivity</w:t>
-      </w:r>
-      <w:proofErr w:type="spellEnd"/>
-      <w:r>
-        <w:rPr>
-          <w:rFonts w:ascii="Times New Roman" w:hAnsi="Times New Roman" w:cs="Times New Roman"/>
-        </w:rPr>
-        <w:t xml:space="preserve"> array has more than 10 entries, and if it does, it keeps the last 10. This is done as it was decided that the “Latest Activity” element of the home screen should keep the 10 latest task-related actions taken by the user. Next, the </w:t>
-      </w:r>
-      <w:proofErr w:type="spellStart"/>
-      <w:r>
-        <w:rPr>
-          <w:rFonts w:ascii="Times New Roman" w:hAnsi="Times New Roman" w:cs="Times New Roman"/>
-        </w:rPr>
-        <w:t>updateSummary</w:t>
-      </w:r>
-      <w:proofErr w:type="spellEnd"/>
-      <w:r>
-        <w:rPr>
-          <w:rFonts w:ascii="Times New Roman" w:hAnsi="Times New Roman" w:cs="Times New Roman"/>
-        </w:rPr>
-        <w:t xml:space="preserve">() function, counts the total tasks by calculating the length of the “tasks” array. </w:t>
-      </w:r>
-      <w:r>
-        <w:rPr>
-          <w:rFonts w:ascii="Times New Roman" w:hAnsi="Times New Roman" w:cs="Times New Roman"/>
-        </w:rPr>
-        <w:t xml:space="preserve">Creates a new array and calculates its length as well in order to find the number of the completed tasks, and then subtracts the completed tasks from the total to find the number of the pending tasks. Having done that, the related elements of the html page are updated, so that the proper numbers are displayed. Lastly, the </w:t>
-      </w:r>
-      <w:proofErr w:type="spellStart"/>
-      <w:r>
-        <w:rPr>
-          <w:rFonts w:ascii="Times New Roman" w:hAnsi="Times New Roman" w:cs="Times New Roman"/>
-        </w:rPr>
-        <w:t>renderTasks</w:t>
-      </w:r>
-      <w:proofErr w:type="spellEnd"/>
-      <w:r>
-        <w:rPr>
-          <w:rFonts w:ascii="Times New Roman" w:hAnsi="Times New Roman" w:cs="Times New Roman"/>
-        </w:rPr>
-        <w:t xml:space="preserve">() function is the core of the task manager UI. It starts by removing all rows from the table, in order to render the latest </w:t>
-      </w:r>
-      <w:r>
-        <w:rPr>
-          <w:rFonts w:ascii="Times New Roman" w:hAnsi="Times New Roman" w:cs="Times New Roman"/>
-        </w:rPr>
-        <w:t>task list. Next, the “</w:t>
-      </w:r>
-      <w:proofErr w:type="spellStart"/>
-      <w:r>
-        <w:rPr>
-          <w:rFonts w:ascii="Times New Roman" w:hAnsi="Times New Roman" w:cs="Times New Roman"/>
-        </w:rPr>
-        <w:t>filteredTasks</w:t>
-      </w:r>
-      <w:proofErr w:type="spellEnd"/>
-      <w:r>
-        <w:rPr>
-          <w:rFonts w:ascii="Times New Roman" w:hAnsi="Times New Roman" w:cs="Times New Roman"/>
-        </w:rPr>
-        <w:t xml:space="preserve">” array is created as a shallow copy of the “tasks” array, so that the “tasks” array is not affected by the changes made during filtering. Next, the priority value is checked, and if anything other than ALL is selected, only tasks matching that priority are kept. The status filter works in a similar way, </w:t>
+        <w:t xml:space="preserve">What follows is the declaration of functions. saveTasks() converts the “tasks” array into a string that can be saved in the localStorage. The saveActivity() function works the same way, but also checks if the taskActivity array has more than 10 entries, and if it does, it keeps the last 10. This is done as it was decided that the “Latest Activity” element of the home screen should keep the 10 latest task-related actions taken by the user. Next, the updateSummary() function, counts the total tasks by calculating the length of the “tasks” array. </w:t>
+      </w:r>
+      <w:r>
+        <w:rPr>
+          <w:rFonts w:ascii="Times New Roman" w:hAnsi="Times New Roman" w:cs="Times New Roman"/>
+        </w:rPr>
+        <w:t xml:space="preserve">Creates a new array and calculates its length as well in order to find the number of the completed tasks, and then subtracts the completed tasks from the total to find the number of the pending tasks. Having done that, the related elements of the html page are updated, so that the proper numbers are displayed. Lastly, the renderTasks() function is the core of the task manager UI. It starts by removing all rows from the table, in order to render the latest </w:t>
+      </w:r>
+      <w:r>
+        <w:rPr>
+          <w:rFonts w:ascii="Times New Roman" w:hAnsi="Times New Roman" w:cs="Times New Roman"/>
+        </w:rPr>
+        <w:t xml:space="preserve">task list. Next, the “filteredTasks” array is created as a shallow copy of the “tasks” array, so that the “tasks” array is not affected by the changes made during filtering. Next, the priority value is checked, and if anything other than ALL is selected, only tasks matching that priority are kept. The status filter works in a similar way, </w:t>
       </w:r>
       <w:r>
         <w:rPr>
@@ -1039,49 +788,13 @@
         <w:rPr>
           <w:rFonts w:ascii="Times New Roman" w:hAnsi="Times New Roman" w:cs="Times New Roman"/>
         </w:rPr>
-        <w:t xml:space="preserve">which will then be appended as children to the table created in the tasks.html. The table buttons are also created for each row. After that, the complete button is created. Once clicked, it toggles the task’s “completed” status, it records the action in </w:t>
-      </w:r>
-      <w:proofErr w:type="spellStart"/>
-      <w:r>
-        <w:rPr>
-          <w:rFonts w:ascii="Times New Roman" w:hAnsi="Times New Roman" w:cs="Times New Roman"/>
-        </w:rPr>
-        <w:t>tasksActivity</w:t>
-      </w:r>
-      <w:proofErr w:type="spellEnd"/>
-      <w:r>
-        <w:rPr>
-          <w:rFonts w:ascii="Times New Roman" w:hAnsi="Times New Roman" w:cs="Times New Roman"/>
-        </w:rPr>
-        <w:t xml:space="preserve">, it saves the task and activity in </w:t>
-      </w:r>
-      <w:proofErr w:type="spellStart"/>
-      <w:r>
-        <w:rPr>
-          <w:rFonts w:ascii="Times New Roman" w:hAnsi="Times New Roman" w:cs="Times New Roman"/>
-        </w:rPr>
-        <w:t>localStorage</w:t>
-      </w:r>
-      <w:proofErr w:type="spellEnd"/>
-      <w:r>
-        <w:rPr>
-          <w:rFonts w:ascii="Times New Roman" w:hAnsi="Times New Roman" w:cs="Times New Roman"/>
-        </w:rPr>
-        <w:t xml:space="preserve">, it re-renders the table and updates the summary, and it fires up an event for the dashboard. The delete button that comes after works in a similar way, removing the task from the “tasks” array, recording the deletion in </w:t>
-      </w:r>
-      <w:proofErr w:type="spellStart"/>
-      <w:r>
-        <w:rPr>
-          <w:rFonts w:ascii="Times New Roman" w:hAnsi="Times New Roman" w:cs="Times New Roman"/>
-        </w:rPr>
-        <w:t>taskActivity</w:t>
-      </w:r>
-      <w:proofErr w:type="spellEnd"/>
-      <w:r>
-        <w:rPr>
-          <w:rFonts w:ascii="Times New Roman" w:hAnsi="Times New Roman" w:cs="Times New Roman"/>
-        </w:rPr>
-        <w:t>, saves, re-renders, and updates the summary and dashboard.</w:t>
+        <w:t>which will then be appended as children to the table created in the tasks.html. The table buttons are also created for each row. After that, the complete button is created. Once clicked, it toggles the task’s “completed” status, it records the action in tasksActivity, it saves the task and activity in localStorage, it re-renders the table and updates the summary, and it fires up an event for the dashboard. The delete button that comes after works in a similar way, removing the task from the “tasks” array, recording the deletion in taskActivity, saves, re-renders, and updates the summary and dashboard.</w:t>
+      </w:r>
+      <w:r>
+        <w:rPr>
+          <w:rFonts w:ascii="Times New Roman" w:hAnsi="Times New Roman" w:cs="Times New Roman"/>
+        </w:rPr>
+        <w:t xml:space="preserve"> After that, the edit button replaces the normal row display with editable input fields, so that the user can make changes. This is done by temporally inserting HTML code in the relevant task and row fields, and either saving the new values and updating the task activity table, or simply re-rendering the task table without saving, in case the user cancels the procedure.</w:t>
       </w:r>
     </w:p>
     <w:p>
@@ -1095,6 +808,7 @@
         <w:rPr>
           <w:rFonts w:ascii="Times New Roman" w:hAnsi="Times New Roman" w:cs="Times New Roman"/>
         </w:rPr>
+        <w:lastRenderedPageBreak/>
         <w:tab/>
         <w:t xml:space="preserve">Afterwards, event listeners are added that fire up when the filters or sorting options are clicked. </w:t>
       </w:r>
@@ -1111,82 +825,13 @@
           <w:rFonts w:ascii="Times New Roman" w:hAnsi="Times New Roman" w:cs="Times New Roman"/>
         </w:rPr>
         <w:tab/>
-        <w:t xml:space="preserve">Lastly, the </w:t>
-      </w:r>
-      <w:proofErr w:type="spellStart"/>
-      <w:r>
-        <w:rPr>
-          <w:rFonts w:ascii="Times New Roman" w:hAnsi="Times New Roman" w:cs="Times New Roman"/>
-        </w:rPr>
-        <w:t>eventListener</w:t>
-      </w:r>
-      <w:proofErr w:type="spellEnd"/>
-      <w:r>
-        <w:rPr>
-          <w:rFonts w:ascii="Times New Roman" w:hAnsi="Times New Roman" w:cs="Times New Roman"/>
-        </w:rPr>
-        <w:t xml:space="preserve"> corresponding to the “submit” button of the form is added. When fired up, it </w:t>
-      </w:r>
-      <w:r>
-        <w:rPr>
-          <w:rFonts w:ascii="Times New Roman" w:hAnsi="Times New Roman" w:cs="Times New Roman"/>
-        </w:rPr>
-        <w:t xml:space="preserve">starts by preventing the default form behavior. By default, submitting a form reloads </w:t>
-      </w:r>
-      <w:r>
-        <w:rPr>
-          <w:rFonts w:ascii="Times New Roman" w:hAnsi="Times New Roman" w:cs="Times New Roman"/>
-        </w:rPr>
-        <w:lastRenderedPageBreak/>
-        <w:t xml:space="preserve">the page or sends a request to a server. By using the </w:t>
-      </w:r>
-      <w:proofErr w:type="spellStart"/>
-      <w:r>
-        <w:rPr>
-          <w:rFonts w:ascii="Times New Roman" w:hAnsi="Times New Roman" w:cs="Times New Roman"/>
-        </w:rPr>
-        <w:t>e.preventDefault</w:t>
-      </w:r>
-      <w:proofErr w:type="spellEnd"/>
-      <w:r>
-        <w:rPr>
-          <w:rFonts w:ascii="Times New Roman" w:hAnsi="Times New Roman" w:cs="Times New Roman"/>
-        </w:rPr>
-        <w:t>();</w:t>
-      </w:r>
-      <w:r>
-        <w:rPr>
-          <w:rFonts w:ascii="Times New Roman" w:hAnsi="Times New Roman" w:cs="Times New Roman"/>
-        </w:rPr>
-        <w:t xml:space="preserve"> option we ensure that we can handle the form entirely with JavaScript. After that, the input values are read, a new “task” object is created with the inserted data and entered in the “tasks” array, the updated activity array is stored in </w:t>
-      </w:r>
-      <w:proofErr w:type="spellStart"/>
-      <w:r>
-        <w:rPr>
-          <w:rFonts w:ascii="Times New Roman" w:hAnsi="Times New Roman" w:cs="Times New Roman"/>
-        </w:rPr>
-        <w:t>localStorage</w:t>
-      </w:r>
-      <w:proofErr w:type="spellEnd"/>
-      <w:r>
-        <w:rPr>
-          <w:rFonts w:ascii="Times New Roman" w:hAnsi="Times New Roman" w:cs="Times New Roman"/>
-        </w:rPr>
-        <w:t>, as well as the new “tasks” array, and the “</w:t>
-      </w:r>
-      <w:proofErr w:type="spellStart"/>
-      <w:r>
-        <w:rPr>
-          <w:rFonts w:ascii="Times New Roman" w:hAnsi="Times New Roman" w:cs="Times New Roman"/>
-        </w:rPr>
-        <w:t>tasksUpdated</w:t>
-      </w:r>
-      <w:proofErr w:type="spellEnd"/>
-      <w:r>
-        <w:rPr>
-          <w:rFonts w:ascii="Times New Roman" w:hAnsi="Times New Roman" w:cs="Times New Roman"/>
-        </w:rPr>
-        <w:t xml:space="preserve">” event is triggered. Having done that, the fields are reset so that the user can enter new data, the table is refreshed to include the new task, and the summary is updated to include the correct numbers. </w:t>
+        <w:t xml:space="preserve">Lastly, the eventListener corresponding to the “submit” button of the form is added. When fired up, it </w:t>
+      </w:r>
+      <w:r>
+        <w:rPr>
+          <w:rFonts w:ascii="Times New Roman" w:hAnsi="Times New Roman" w:cs="Times New Roman"/>
+        </w:rPr>
+        <w:t xml:space="preserve">starts by preventing the default form behavior. By default, submitting a form reloads the page or sends a request to a server. By using the e.preventDefault(); option we ensure that we can handle the form entirely with JavaScript. After that, the input values are read, a new “task” object is created with the inserted data and entered in the “tasks” array, the updated activity array is stored in localStorage, as well as the new “tasks” array, and the “tasksUpdated” event is triggered. Having done that, the fields are reset so that the user can enter new data, the table is refreshed to include the new task, and the summary is updated to include the correct numbers. </w:t>
       </w:r>
     </w:p>
     <w:p>
@@ -1201,35 +846,7 @@
           <w:rFonts w:ascii="Times New Roman" w:hAnsi="Times New Roman" w:cs="Times New Roman"/>
         </w:rPr>
         <w:tab/>
-        <w:t>The initial render part also calls the ren</w:t>
-      </w:r>
-      <w:proofErr w:type="spellStart"/>
-      <w:r>
-        <w:rPr>
-          <w:rFonts w:ascii="Times New Roman" w:hAnsi="Times New Roman" w:cs="Times New Roman"/>
-        </w:rPr>
-        <w:t>derTasks</w:t>
-      </w:r>
-      <w:proofErr w:type="spellEnd"/>
-      <w:r>
-        <w:rPr>
-          <w:rFonts w:ascii="Times New Roman" w:hAnsi="Times New Roman" w:cs="Times New Roman"/>
-        </w:rPr>
-        <w:t xml:space="preserve">() and </w:t>
-      </w:r>
-      <w:proofErr w:type="spellStart"/>
-      <w:r>
-        <w:rPr>
-          <w:rFonts w:ascii="Times New Roman" w:hAnsi="Times New Roman" w:cs="Times New Roman"/>
-        </w:rPr>
-        <w:t>updateSummary</w:t>
-      </w:r>
-      <w:proofErr w:type="spellEnd"/>
-      <w:r>
-        <w:rPr>
-          <w:rFonts w:ascii="Times New Roman" w:hAnsi="Times New Roman" w:cs="Times New Roman"/>
-        </w:rPr>
-        <w:t>() functions to initialize the relevant elements.</w:t>
+        <w:t>The initial render part also calls the renderTasks() and updateSummary() functions to initialize the relevant elements.</w:t>
       </w:r>
     </w:p>
     <w:p>
@@ -1261,21 +878,7 @@
           <w:rFonts w:ascii="Times New Roman" w:hAnsi="Times New Roman" w:cs="Times New Roman"/>
         </w:rPr>
         <w:tab/>
-        <w:t xml:space="preserve">The style.css contains the </w:t>
-      </w:r>
-      <w:proofErr w:type="spellStart"/>
-      <w:r>
-        <w:rPr>
-          <w:rFonts w:ascii="Times New Roman" w:hAnsi="Times New Roman" w:cs="Times New Roman"/>
-        </w:rPr>
-        <w:t>css</w:t>
-      </w:r>
-      <w:proofErr w:type="spellEnd"/>
-      <w:r>
-        <w:rPr>
-          <w:rFonts w:ascii="Times New Roman" w:hAnsi="Times New Roman" w:cs="Times New Roman"/>
-        </w:rPr>
-        <w:t xml:space="preserve"> code related to the entire website, but in this section we will focus on the parts related to the tasks page. We begin with the form, summary and task table sections. There, </w:t>
+        <w:t xml:space="preserve">The style.css contains the css code related to the entire website, but in this section we will focus on the parts related to the tasks page. We begin with the form, summary and task table sections. There, </w:t>
       </w:r>
       <w:r>
         <w:rPr>
@@ -1284,8 +887,53 @@
         <w:t xml:space="preserve">the padding, margin, shadow, border radius and background color are set. After that, all the input and text areas inside the form are modified. Each input is set up to take a full line, each input stretches to fill the form’s width, and then space between the inputs (margin-bottom) is implemented as well as space inside the input (padding) so that the letters do not touch the edges. </w:t>
       </w:r>
     </w:p>
+    <w:p>
+      <w:pPr>
+        <w:pStyle w:val="Heading1"/>
+        <w:numPr>
+          <w:ilvl w:val="0"/>
+          <w:numId w:val="1"/>
+        </w:numPr>
+        <w:rPr>
+          <w:rFonts w:ascii="Times New Roman" w:hAnsi="Times New Roman" w:cs="Times New Roman"/>
+        </w:rPr>
+      </w:pPr>
+      <w:r>
+        <w:rPr>
+          <w:rFonts w:ascii="Times New Roman" w:hAnsi="Times New Roman" w:cs="Times New Roman"/>
+        </w:rPr>
+        <w:t>Latest Activity Section</w:t>
+      </w:r>
+    </w:p>
+    <w:p>
+      <w:pPr>
+        <w:ind w:firstLine="360"/>
+        <w:jc w:val="both"/>
+        <w:rPr>
+          <w:rFonts w:ascii="Times New Roman" w:hAnsi="Times New Roman" w:cs="Times New Roman"/>
+        </w:rPr>
+      </w:pPr>
+      <w:r>
+        <w:rPr>
+          <w:rFonts w:ascii="Times New Roman" w:hAnsi="Times New Roman" w:cs="Times New Roman"/>
+        </w:rPr>
+        <w:t>For the latest activity tracking, a suitable container is first created in the index.html. Then, this list is targeted by a querySelector found in recentActivity.js and populated. In order for it to be populated, every time an activity takes place, a relevant entry is created in the local storage, as was shown in the “Tasks” section of the report. Thus, these entries are read, and each activity is rendered as an item of the list. It is worth mentioning that the “</w:t>
+      </w:r>
+      <w:r>
+        <w:rPr>
+          <w:rFonts w:ascii="Times New Roman" w:hAnsi="Times New Roman" w:cs="Times New Roman"/>
+        </w:rPr>
+        <w:t>activityList.prepend(li);</w:t>
+      </w:r>
+      <w:r>
+        <w:rPr>
+          <w:rFonts w:ascii="Times New Roman" w:hAnsi="Times New Roman" w:cs="Times New Roman"/>
+        </w:rPr>
+        <w:t>” is used in order to have the newest activity appear at the top of the list.</w:t>
+      </w:r>
+    </w:p>
     <w:sectPr>
-      <w:headerReference w:type="default" r:id="rId7"/>
+      <w:headerReference w:type="default" r:id="rId8"/>
       <w:pgSz w:w="12240" w:h="15840"/>
       <w:pgMar w:top="1440" w:right="1440" w:bottom="1440" w:left="1440" w:header="720" w:footer="720" w:gutter="0"/>
       <w:cols w:space="720"/>
@@ -1416,6 +1064,103 @@
     </w:pPr>
   </w:p>
 </w:hdr>
+</file>
+
+<file path=word/numbering.xml><?xml version="1.0" encoding="utf-8"?>
+<w:numbering xmlns:wpc="http://schemas.microsoft.com/office/word/2010/wordprocessingCanvas" xmlns:cx="http://schemas.microsoft.com/office/drawing/2014/chartex" xmlns:cx1="http://schemas.microsoft.com/office/drawing/2015/9/8/chartex" xmlns:cx2="http://schemas.microsoft.com/office/drawing/2015/10/21/chartex" xmlns:cx3="http://schemas.microsoft.com/office/drawing/2016/5/9/chartex" xmlns:cx4="http://schemas.microsoft.com/office/drawing/2016/5/10/chartex" xmlns:cx5="http://schemas.microsoft.com/office/drawing/2016/5/11/chartex" xmlns:cx6="http://schemas.microsoft.com/office/drawing/2016/5/12/chartex" xmlns:cx7="http://schemas.microsoft.com/office/drawing/2016/5/13/chartex" xmlns:cx8="http://schemas.microsoft.com/office/drawing/2016/5/14/chartex" xmlns:mc="http://schemas.openxmlformats.org/markup-compatibility/2006" xmlns:aink="http://schemas.microsoft.com/office/drawing/2016/ink" xmlns:am3d="http://schemas.microsoft.com/office/drawing/2017/model3d" xmlns:o="urn:schemas-microsoft-com:office:office" xmlns:oel="http://schemas.microsoft.com/office/2019/extlst" xmlns:r="http://schemas.openxmlformats.org/officeDocument/2006/relationships" xmlns:m="http://schemas.openxmlformats.org/officeDocument/2006/math" xmlns:v="urn:schemas-microsoft-com:vml" xmlns:wp14="http://schemas.microsoft.com/office/word/2010/wordprocessingDrawing" xmlns:wp="http://schemas.openxmlformats.org/drawingml/2006/wordprocessingDrawing" xmlns:w10="urn:schemas-microsoft-com:office:word" xmlns:w="http://schemas.openxmlformats.org/wordprocessingml/2006/main" xmlns:w14="http://schemas.microsoft.com/office/word/2010/wordml" xmlns:w15="http://schemas.microsoft.com/office/word/2012/wordml" xmlns:w16cex="http://schemas.microsoft.com/office/word/2018/wordml/cex" xmlns:w16cid="http://schemas.microsoft.com/office/word/2016/wordml/cid" xmlns:w16="http://schemas.microsoft.com/office/word/2018/wordml" xmlns:w16du="http://schemas.microsoft.com/office/word/2023/wordml/word16du" xmlns:w16sdtdh="http://schemas.microsoft.com/office/word/2020/wordml/sdtdatahash" xmlns:w16sdtfl="http://schemas.microsoft.com/office/word/2024/wordml/sdtformatlock" xmlns:w16se="http://schemas.microsoft.com/office/word/2015/wordml/symex" xmlns:wpg="http://schemas.microsoft.com/office/word/2010/wordprocessingGroup" xmlns:wpi="http://schemas.microsoft.com/office/word/2010/wordprocessingInk" xmlns:wne="http://schemas.microsoft.com/office/word/2006/wordml" xmlns:wps="http://schemas.microsoft.com/office/word/2010/wordprocessingShape" mc:Ignorable="w14 w15 w16se w16cid w16 w16cex w16sdtdh w16sdtfl w16du wp14">
+  <w:abstractNum w:abstractNumId="0" w15:restartNumberingAfterBreak="0">
+    <w:nsid w:val="4FD84BF8"/>
+    <w:multiLevelType w:val="hybridMultilevel"/>
+    <w:tmpl w:val="3D0087E8"/>
+    <w:lvl w:ilvl="0" w:tplc="0409000F">
+      <w:start w:val="1"/>
+      <w:numFmt w:val="decimal"/>
+      <w:lvlText w:val="%1."/>
+      <w:lvlJc w:val="left"/>
+      <w:pPr>
+        <w:ind w:left="720" w:hanging="360"/>
+      </w:pPr>
+      <w:rPr>
+        <w:rFonts w:hint="default"/>
+      </w:rPr>
+    </w:lvl>
+    <w:lvl w:ilvl="1" w:tplc="04090019" w:tentative="1">
+      <w:start w:val="1"/>
+      <w:numFmt w:val="lowerLetter"/>
+      <w:lvlText w:val="%2."/>
+      <w:lvlJc w:val="left"/>
+      <w:pPr>
+        <w:ind w:left="1440" w:hanging="360"/>
+      </w:pPr>
+    </w:lvl>
+    <w:lvl w:ilvl="2" w:tplc="0409001B" w:tentative="1">
+      <w:start w:val="1"/>
+      <w:numFmt w:val="lowerRoman"/>
+      <w:lvlText w:val="%3."/>
+      <w:lvlJc w:val="right"/>
+      <w:pPr>
+        <w:ind w:left="2160" w:hanging="180"/>
+      </w:pPr>
+    </w:lvl>
+    <w:lvl w:ilvl="3" w:tplc="0409000F" w:tentative="1">
+      <w:start w:val="1"/>
+      <w:numFmt w:val="decimal"/>
+      <w:lvlText w:val="%4."/>
+      <w:lvlJc w:val="left"/>
+      <w:pPr>
+        <w:ind w:left="2880" w:hanging="360"/>
+      </w:pPr>
+    </w:lvl>
+    <w:lvl w:ilvl="4" w:tplc="04090019" w:tentative="1">
+      <w:start w:val="1"/>
+      <w:numFmt w:val="lowerLetter"/>
+      <w:lvlText w:val="%5."/>
+      <w:lvlJc w:val="left"/>
+      <w:pPr>
+        <w:ind w:left="3600" w:hanging="360"/>
+      </w:pPr>
+    </w:lvl>
+    <w:lvl w:ilvl="5" w:tplc="0409001B" w:tentative="1">
+      <w:start w:val="1"/>
+      <w:numFmt w:val="lowerRoman"/>
+      <w:lvlText w:val="%6."/>
+      <w:lvlJc w:val="right"/>
+      <w:pPr>
+        <w:ind w:left="4320" w:hanging="180"/>
+      </w:pPr>
+    </w:lvl>
+    <w:lvl w:ilvl="6" w:tplc="0409000F" w:tentative="1">
+      <w:start w:val="1"/>
+      <w:numFmt w:val="decimal"/>
+      <w:lvlText w:val="%7."/>
+      <w:lvlJc w:val="left"/>
+      <w:pPr>
+        <w:ind w:left="5040" w:hanging="360"/>
+      </w:pPr>
+    </w:lvl>
+    <w:lvl w:ilvl="7" w:tplc="04090019" w:tentative="1">
+      <w:start w:val="1"/>
+      <w:numFmt w:val="lowerLetter"/>
+      <w:lvlText w:val="%8."/>
+      <w:lvlJc w:val="left"/>
+      <w:pPr>
+        <w:ind w:left="5760" w:hanging="360"/>
+      </w:pPr>
+    </w:lvl>
+    <w:lvl w:ilvl="8" w:tplc="0409001B" w:tentative="1">
+      <w:start w:val="1"/>
+      <w:numFmt w:val="lowerRoman"/>
+      <w:lvlText w:val="%9."/>
+      <w:lvlJc w:val="right"/>
+      <w:pPr>
+        <w:ind w:left="6480" w:hanging="180"/>
+      </w:pPr>
+    </w:lvl>
+  </w:abstractNum>
+  <w:num w:numId="1" w16cid:durableId="1823306566">
+    <w:abstractNumId w:val="0"/>
+  </w:num>
+</w:numbering>
 </file>
 
 <file path=word/styles.xml><?xml version="1.0" encoding="utf-8"?>

</xml_diff>

<commit_message>
Added Github link to report and final commit
</commit_message>
<xml_diff>
--- a/Midterm_Report_Mantzaridis.docx
+++ b/Midterm_Report_Mantzaridis.docx
@@ -89,8 +89,16 @@
         <w:rPr>
           <w:rFonts w:ascii="Times New Roman" w:hAnsi="Times New Roman" w:cs="Times New Roman"/>
         </w:rPr>
-        <w:t>Prof. Leonardos Mageiros</w:t>
-      </w:r>
+        <w:t xml:space="preserve">Prof. Leonardos </w:t>
+      </w:r>
+      <w:proofErr w:type="spellStart"/>
+      <w:r>
+        <w:rPr>
+          <w:rFonts w:ascii="Times New Roman" w:hAnsi="Times New Roman" w:cs="Times New Roman"/>
+        </w:rPr>
+        <w:t>Mageiros</w:t>
+      </w:r>
+      <w:proofErr w:type="spellEnd"/>
     </w:p>
     <w:p>
       <w:pPr>
@@ -579,13 +587,55 @@
         <w:rPr>
           <w:rFonts w:ascii="Times New Roman" w:hAnsi="Times New Roman" w:cs="Times New Roman"/>
         </w:rPr>
-        <w:t xml:space="preserve">and should be rendered in standard mode. Then the lang="en" is used to signal to the browser that the site is written in English. This helps with accessibility and translation purposes. </w:t>
-      </w:r>
-      <w:r>
-        <w:rPr>
-          <w:rFonts w:ascii="Times New Roman" w:hAnsi="Times New Roman" w:cs="Times New Roman"/>
-        </w:rPr>
-        <w:t xml:space="preserve">Next, &lt;link rel="stylesheet" href="style.css"&gt; is used to connect the html file to the style.css files, which contains all the stylistic aspects of the webpage. After that, the &lt;meta charset="UTF-8" /&gt; tag is used to indicate that the document’s characters should be interpreted using UTF-8. Lastly, before closing the head, all the relevant JavaScript files are linked using the “defer” keyword. </w:t>
+        <w:t>and should be rendered in standard mode. Then the lang="</w:t>
+      </w:r>
+      <w:proofErr w:type="spellStart"/>
+      <w:r>
+        <w:rPr>
+          <w:rFonts w:ascii="Times New Roman" w:hAnsi="Times New Roman" w:cs="Times New Roman"/>
+        </w:rPr>
+        <w:t>en</w:t>
+      </w:r>
+      <w:proofErr w:type="spellEnd"/>
+      <w:r>
+        <w:rPr>
+          <w:rFonts w:ascii="Times New Roman" w:hAnsi="Times New Roman" w:cs="Times New Roman"/>
+        </w:rPr>
+        <w:t xml:space="preserve">" is used to signal to the browser that the site is written in English. This helps with accessibility and translation purposes. </w:t>
+      </w:r>
+      <w:r>
+        <w:rPr>
+          <w:rFonts w:ascii="Times New Roman" w:hAnsi="Times New Roman" w:cs="Times New Roman"/>
+        </w:rPr>
+        <w:t xml:space="preserve">Next, &lt;link </w:t>
+      </w:r>
+      <w:proofErr w:type="spellStart"/>
+      <w:r>
+        <w:rPr>
+          <w:rFonts w:ascii="Times New Roman" w:hAnsi="Times New Roman" w:cs="Times New Roman"/>
+        </w:rPr>
+        <w:t>rel</w:t>
+      </w:r>
+      <w:proofErr w:type="spellEnd"/>
+      <w:r>
+        <w:rPr>
+          <w:rFonts w:ascii="Times New Roman" w:hAnsi="Times New Roman" w:cs="Times New Roman"/>
+        </w:rPr>
+        <w:t xml:space="preserve">="stylesheet" </w:t>
+      </w:r>
+      <w:proofErr w:type="spellStart"/>
+      <w:r>
+        <w:rPr>
+          <w:rFonts w:ascii="Times New Roman" w:hAnsi="Times New Roman" w:cs="Times New Roman"/>
+        </w:rPr>
+        <w:t>href</w:t>
+      </w:r>
+      <w:proofErr w:type="spellEnd"/>
+      <w:r>
+        <w:rPr>
+          <w:rFonts w:ascii="Times New Roman" w:hAnsi="Times New Roman" w:cs="Times New Roman"/>
+        </w:rPr>
+        <w:t xml:space="preserve">="style.css"&gt; is used to connect the html file to the style.css files, which contains all the stylistic aspects of the webpage. After that, the &lt;meta charset="UTF-8" /&gt; tag is used to indicate that the document’s characters should be interpreted using UTF-8. Lastly, before closing the head, all the relevant JavaScript files are linked using the “defer” keyword. </w:t>
       </w:r>
     </w:p>
     <w:p>
@@ -749,7 +799,35 @@
         <w:rPr>
           <w:rFonts w:ascii="Times New Roman" w:hAnsi="Times New Roman" w:cs="Times New Roman"/>
         </w:rPr>
-        <w:t xml:space="preserve">This, JSON.parse() is utilized to take the strings stored in localStorage and turn them into usable JavaScript objects. In this case, it creates arrays. At this point, we use the “let” keyword, as the arrays created may be later reassigned, sliced, or replaced, things that would not be possible if they were declared as constants. </w:t>
+        <w:t xml:space="preserve">This, </w:t>
+      </w:r>
+      <w:proofErr w:type="spellStart"/>
+      <w:r>
+        <w:rPr>
+          <w:rFonts w:ascii="Times New Roman" w:hAnsi="Times New Roman" w:cs="Times New Roman"/>
+        </w:rPr>
+        <w:t>JSON.parse</w:t>
+      </w:r>
+      <w:proofErr w:type="spellEnd"/>
+      <w:r>
+        <w:rPr>
+          <w:rFonts w:ascii="Times New Roman" w:hAnsi="Times New Roman" w:cs="Times New Roman"/>
+        </w:rPr>
+        <w:t xml:space="preserve">() is utilized to take the strings stored in </w:t>
+      </w:r>
+      <w:proofErr w:type="spellStart"/>
+      <w:r>
+        <w:rPr>
+          <w:rFonts w:ascii="Times New Roman" w:hAnsi="Times New Roman" w:cs="Times New Roman"/>
+        </w:rPr>
+        <w:t>localStorage</w:t>
+      </w:r>
+      <w:proofErr w:type="spellEnd"/>
+      <w:r>
+        <w:rPr>
+          <w:rFonts w:ascii="Times New Roman" w:hAnsi="Times New Roman" w:cs="Times New Roman"/>
+        </w:rPr>
+        <w:t xml:space="preserve"> and turn them into usable JavaScript objects. In this case, it creates arrays. At this point, we use the “let” keyword, as the arrays created may be later reassigned, sliced, or replaced, things that would not be possible if they were declared as constants. </w:t>
       </w:r>
     </w:p>
     <w:p>
@@ -764,19 +842,163 @@
           <w:rFonts w:ascii="Times New Roman" w:hAnsi="Times New Roman" w:cs="Times New Roman"/>
         </w:rPr>
         <w:tab/>
-        <w:t xml:space="preserve">What follows is the declaration of functions. saveTasks() converts the “tasks” array into a string that can be saved in the localStorage. The saveActivity() function works the same way, but also checks if the taskActivity array has more than 10 entries, and if it does, it keeps the last 10. This is done as it was decided that the “Latest Activity” element of the home screen should keep the 10 latest task-related actions taken by the user. Next, the updateSummary() function, counts the total tasks by calculating the length of the “tasks” array. </w:t>
-      </w:r>
-      <w:r>
-        <w:rPr>
-          <w:rFonts w:ascii="Times New Roman" w:hAnsi="Times New Roman" w:cs="Times New Roman"/>
-        </w:rPr>
-        <w:t xml:space="preserve">Creates a new array and calculates its length as well in order to find the number of the completed tasks, and then subtracts the completed tasks from the total to find the number of the pending tasks. Having done that, the related elements of the html page are updated, so that the proper numbers are displayed. Lastly, the renderTasks() function is the core of the task manager UI. It starts by removing all rows from the table, in order to render the latest </w:t>
-      </w:r>
-      <w:r>
-        <w:rPr>
-          <w:rFonts w:ascii="Times New Roman" w:hAnsi="Times New Roman" w:cs="Times New Roman"/>
-        </w:rPr>
-        <w:t xml:space="preserve">task list. Next, the “filteredTasks” array is created as a shallow copy of the “tasks” array, so that the “tasks” array is not affected by the changes made during filtering. Next, the priority value is checked, and if anything other than ALL is selected, only tasks matching that priority are kept. The status filter works in a similar way, </w:t>
+        <w:t xml:space="preserve">What follows is the declaration of functions. </w:t>
+      </w:r>
+      <w:proofErr w:type="spellStart"/>
+      <w:proofErr w:type="gramStart"/>
+      <w:r>
+        <w:rPr>
+          <w:rFonts w:ascii="Times New Roman" w:hAnsi="Times New Roman" w:cs="Times New Roman"/>
+        </w:rPr>
+        <w:t>saveTasks</w:t>
+      </w:r>
+      <w:proofErr w:type="spellEnd"/>
+      <w:r>
+        <w:rPr>
+          <w:rFonts w:ascii="Times New Roman" w:hAnsi="Times New Roman" w:cs="Times New Roman"/>
+        </w:rPr>
+        <w:t>(</w:t>
+      </w:r>
+      <w:proofErr w:type="gramEnd"/>
+      <w:r>
+        <w:rPr>
+          <w:rFonts w:ascii="Times New Roman" w:hAnsi="Times New Roman" w:cs="Times New Roman"/>
+        </w:rPr>
+        <w:t xml:space="preserve">) converts the “tasks” array into a string that can be saved in the </w:t>
+      </w:r>
+      <w:proofErr w:type="spellStart"/>
+      <w:r>
+        <w:rPr>
+          <w:rFonts w:ascii="Times New Roman" w:hAnsi="Times New Roman" w:cs="Times New Roman"/>
+        </w:rPr>
+        <w:t>localStorage</w:t>
+      </w:r>
+      <w:proofErr w:type="spellEnd"/>
+      <w:r>
+        <w:rPr>
+          <w:rFonts w:ascii="Times New Roman" w:hAnsi="Times New Roman" w:cs="Times New Roman"/>
+        </w:rPr>
+        <w:t xml:space="preserve">. The </w:t>
+      </w:r>
+      <w:proofErr w:type="spellStart"/>
+      <w:proofErr w:type="gramStart"/>
+      <w:r>
+        <w:rPr>
+          <w:rFonts w:ascii="Times New Roman" w:hAnsi="Times New Roman" w:cs="Times New Roman"/>
+        </w:rPr>
+        <w:t>saveActivity</w:t>
+      </w:r>
+      <w:proofErr w:type="spellEnd"/>
+      <w:r>
+        <w:rPr>
+          <w:rFonts w:ascii="Times New Roman" w:hAnsi="Times New Roman" w:cs="Times New Roman"/>
+        </w:rPr>
+        <w:t>(</w:t>
+      </w:r>
+      <w:proofErr w:type="gramEnd"/>
+      <w:r>
+        <w:rPr>
+          <w:rFonts w:ascii="Times New Roman" w:hAnsi="Times New Roman" w:cs="Times New Roman"/>
+        </w:rPr>
+        <w:t xml:space="preserve">) function works the same way, but also checks if the </w:t>
+      </w:r>
+      <w:proofErr w:type="spellStart"/>
+      <w:r>
+        <w:rPr>
+          <w:rFonts w:ascii="Times New Roman" w:hAnsi="Times New Roman" w:cs="Times New Roman"/>
+        </w:rPr>
+        <w:t>taskActivity</w:t>
+      </w:r>
+      <w:proofErr w:type="spellEnd"/>
+      <w:r>
+        <w:rPr>
+          <w:rFonts w:ascii="Times New Roman" w:hAnsi="Times New Roman" w:cs="Times New Roman"/>
+        </w:rPr>
+        <w:t xml:space="preserve"> array has more than 10 entries, and if it does, it keeps the last 10. This is done as it was decided that the “Latest Activity” element of the home screen should keep the 10 latest task-related actions taken by the user. Next, the </w:t>
+      </w:r>
+      <w:proofErr w:type="spellStart"/>
+      <w:proofErr w:type="gramStart"/>
+      <w:r>
+        <w:rPr>
+          <w:rFonts w:ascii="Times New Roman" w:hAnsi="Times New Roman" w:cs="Times New Roman"/>
+        </w:rPr>
+        <w:t>updateSummary</w:t>
+      </w:r>
+      <w:proofErr w:type="spellEnd"/>
+      <w:r>
+        <w:rPr>
+          <w:rFonts w:ascii="Times New Roman" w:hAnsi="Times New Roman" w:cs="Times New Roman"/>
+        </w:rPr>
+        <w:t>(</w:t>
+      </w:r>
+      <w:proofErr w:type="gramEnd"/>
+      <w:r>
+        <w:rPr>
+          <w:rFonts w:ascii="Times New Roman" w:hAnsi="Times New Roman" w:cs="Times New Roman"/>
+        </w:rPr>
+        <w:t xml:space="preserve">) function, counts the total tasks by calculating the length of the “tasks” array. </w:t>
+      </w:r>
+      <w:r>
+        <w:rPr>
+          <w:rFonts w:ascii="Times New Roman" w:hAnsi="Times New Roman" w:cs="Times New Roman"/>
+        </w:rPr>
+        <w:t xml:space="preserve">Creates a new array and calculates its length as well in order to find the number of the completed tasks, and then subtracts the completed tasks from the total to find the number of the pending tasks. Having done that, the related elements of the html page are updated, so that the proper numbers are displayed. Lastly, the </w:t>
+      </w:r>
+      <w:proofErr w:type="spellStart"/>
+      <w:proofErr w:type="gramStart"/>
+      <w:r>
+        <w:rPr>
+          <w:rFonts w:ascii="Times New Roman" w:hAnsi="Times New Roman" w:cs="Times New Roman"/>
+        </w:rPr>
+        <w:t>renderTasks</w:t>
+      </w:r>
+      <w:proofErr w:type="spellEnd"/>
+      <w:r>
+        <w:rPr>
+          <w:rFonts w:ascii="Times New Roman" w:hAnsi="Times New Roman" w:cs="Times New Roman"/>
+        </w:rPr>
+        <w:t>(</w:t>
+      </w:r>
+      <w:proofErr w:type="gramEnd"/>
+      <w:r>
+        <w:rPr>
+          <w:rFonts w:ascii="Times New Roman" w:hAnsi="Times New Roman" w:cs="Times New Roman"/>
+        </w:rPr>
+        <w:t xml:space="preserve">) function is the core of the task manager UI. It starts by removing all rows from the table, in order to render the latest </w:t>
+      </w:r>
+      <w:r>
+        <w:rPr>
+          <w:rFonts w:ascii="Times New Roman" w:hAnsi="Times New Roman" w:cs="Times New Roman"/>
+        </w:rPr>
+        <w:t>task list. Next, the “</w:t>
+      </w:r>
+      <w:proofErr w:type="spellStart"/>
+      <w:r>
+        <w:rPr>
+          <w:rFonts w:ascii="Times New Roman" w:hAnsi="Times New Roman" w:cs="Times New Roman"/>
+        </w:rPr>
+        <w:t>filteredTasks</w:t>
+      </w:r>
+      <w:proofErr w:type="spellEnd"/>
+      <w:r>
+        <w:rPr>
+          <w:rFonts w:ascii="Times New Roman" w:hAnsi="Times New Roman" w:cs="Times New Roman"/>
+        </w:rPr>
+        <w:t xml:space="preserve">” array is created as a shallow copy of the “tasks” array, so that the “tasks” array is not affected by the changes made during filtering. Next, the priority value is checked, and if anything other than ALL is selected, only tasks matching that priority </w:t>
+      </w:r>
+      <w:proofErr w:type="gramStart"/>
+      <w:r>
+        <w:rPr>
+          <w:rFonts w:ascii="Times New Roman" w:hAnsi="Times New Roman" w:cs="Times New Roman"/>
+        </w:rPr>
+        <w:t>are</w:t>
+      </w:r>
+      <w:proofErr w:type="gramEnd"/>
+      <w:r>
+        <w:rPr>
+          <w:rFonts w:ascii="Times New Roman" w:hAnsi="Times New Roman" w:cs="Times New Roman"/>
+        </w:rPr>
+        <w:t xml:space="preserve"> kept. The status filter works in a similar way, </w:t>
       </w:r>
       <w:r>
         <w:rPr>
@@ -800,7 +1022,49 @@
         <w:rPr>
           <w:rFonts w:ascii="Times New Roman" w:hAnsi="Times New Roman" w:cs="Times New Roman"/>
         </w:rPr>
-        <w:t>which will then be appended as children to the table created in the tasks.html. The table buttons are also created for each row. After that, the complete button is created. Once clicked, it toggles the task’s “completed” status, it records the action in tasksActivity, it saves the task and activity in localStorage, it re-renders the table and updates the summary, and it fires up an event for the dashboard. The delete button that comes after works in a similar way, removing the task from the “tasks” array, recording the deletion in taskActivity, saves, re-renders, and updates the summary and dashboard.</w:t>
+        <w:t xml:space="preserve">which will then be appended as children to the table created in the tasks.html. The table buttons are also created for each row. After that, the complete button is created. Once clicked, it toggles the task’s “completed” status, it records the action in </w:t>
+      </w:r>
+      <w:proofErr w:type="spellStart"/>
+      <w:r>
+        <w:rPr>
+          <w:rFonts w:ascii="Times New Roman" w:hAnsi="Times New Roman" w:cs="Times New Roman"/>
+        </w:rPr>
+        <w:t>tasksActivity</w:t>
+      </w:r>
+      <w:proofErr w:type="spellEnd"/>
+      <w:r>
+        <w:rPr>
+          <w:rFonts w:ascii="Times New Roman" w:hAnsi="Times New Roman" w:cs="Times New Roman"/>
+        </w:rPr>
+        <w:t xml:space="preserve">, it saves the task and activity in </w:t>
+      </w:r>
+      <w:proofErr w:type="spellStart"/>
+      <w:r>
+        <w:rPr>
+          <w:rFonts w:ascii="Times New Roman" w:hAnsi="Times New Roman" w:cs="Times New Roman"/>
+        </w:rPr>
+        <w:t>localStorage</w:t>
+      </w:r>
+      <w:proofErr w:type="spellEnd"/>
+      <w:r>
+        <w:rPr>
+          <w:rFonts w:ascii="Times New Roman" w:hAnsi="Times New Roman" w:cs="Times New Roman"/>
+        </w:rPr>
+        <w:t xml:space="preserve">, it re-renders the table and updates the summary, and it fires up an event for the dashboard. The delete button that comes after works in a similar way, removing the task from the “tasks” array, recording the deletion in </w:t>
+      </w:r>
+      <w:proofErr w:type="spellStart"/>
+      <w:r>
+        <w:rPr>
+          <w:rFonts w:ascii="Times New Roman" w:hAnsi="Times New Roman" w:cs="Times New Roman"/>
+        </w:rPr>
+        <w:t>taskActivity</w:t>
+      </w:r>
+      <w:proofErr w:type="spellEnd"/>
+      <w:r>
+        <w:rPr>
+          <w:rFonts w:ascii="Times New Roman" w:hAnsi="Times New Roman" w:cs="Times New Roman"/>
+        </w:rPr>
+        <w:t>, saves, re-renders, and updates the summary and dashboard.</w:t>
       </w:r>
       <w:r>
         <w:rPr>
@@ -837,13 +1101,71 @@
           <w:rFonts w:ascii="Times New Roman" w:hAnsi="Times New Roman" w:cs="Times New Roman"/>
         </w:rPr>
         <w:tab/>
-        <w:t xml:space="preserve">Lastly, the eventListener corresponding to the “submit” button of the form is added. When fired up, it </w:t>
-      </w:r>
-      <w:r>
-        <w:rPr>
-          <w:rFonts w:ascii="Times New Roman" w:hAnsi="Times New Roman" w:cs="Times New Roman"/>
-        </w:rPr>
-        <w:t xml:space="preserve">starts by preventing the default form behavior. By default, submitting a form reloads the page or sends a request to a server. By using the e.preventDefault(); option we ensure that we can handle the form entirely with JavaScript. After that, the input values are read, a new “task” object is created with the inserted data and entered in the “tasks” array, the updated activity array is stored in localStorage, as well as the new “tasks” array, and the “tasksUpdated” event is triggered. Having done that, the fields are reset so that the user can enter new data, the table is refreshed to include the new task, and the summary is updated to include the correct numbers. </w:t>
+        <w:t xml:space="preserve">Lastly, the </w:t>
+      </w:r>
+      <w:proofErr w:type="spellStart"/>
+      <w:r>
+        <w:rPr>
+          <w:rFonts w:ascii="Times New Roman" w:hAnsi="Times New Roman" w:cs="Times New Roman"/>
+        </w:rPr>
+        <w:t>eventListener</w:t>
+      </w:r>
+      <w:proofErr w:type="spellEnd"/>
+      <w:r>
+        <w:rPr>
+          <w:rFonts w:ascii="Times New Roman" w:hAnsi="Times New Roman" w:cs="Times New Roman"/>
+        </w:rPr>
+        <w:t xml:space="preserve"> corresponding to the “submit” button of the form is added. When fired up, it </w:t>
+      </w:r>
+      <w:r>
+        <w:rPr>
+          <w:rFonts w:ascii="Times New Roman" w:hAnsi="Times New Roman" w:cs="Times New Roman"/>
+        </w:rPr>
+        <w:t xml:space="preserve">starts by preventing the default form behavior. By default, submitting a form reloads the page or sends a request to a server. By using the </w:t>
+      </w:r>
+      <w:proofErr w:type="spellStart"/>
+      <w:proofErr w:type="gramStart"/>
+      <w:r>
+        <w:rPr>
+          <w:rFonts w:ascii="Times New Roman" w:hAnsi="Times New Roman" w:cs="Times New Roman"/>
+        </w:rPr>
+        <w:t>e.preventDefault</w:t>
+      </w:r>
+      <w:proofErr w:type="spellEnd"/>
+      <w:proofErr w:type="gramEnd"/>
+      <w:r>
+        <w:rPr>
+          <w:rFonts w:ascii="Times New Roman" w:hAnsi="Times New Roman" w:cs="Times New Roman"/>
+        </w:rPr>
+        <w:t xml:space="preserve">(); option we ensure that we can handle the form entirely with JavaScript. After that, the input values are read, a new “task” object is created with the inserted data and entered in the “tasks” array, the updated activity array is stored in </w:t>
+      </w:r>
+      <w:proofErr w:type="spellStart"/>
+      <w:r>
+        <w:rPr>
+          <w:rFonts w:ascii="Times New Roman" w:hAnsi="Times New Roman" w:cs="Times New Roman"/>
+        </w:rPr>
+        <w:t>localStorage</w:t>
+      </w:r>
+      <w:proofErr w:type="spellEnd"/>
+      <w:r>
+        <w:rPr>
+          <w:rFonts w:ascii="Times New Roman" w:hAnsi="Times New Roman" w:cs="Times New Roman"/>
+        </w:rPr>
+        <w:t>, as well as the new “tasks” array, and the “</w:t>
+      </w:r>
+      <w:proofErr w:type="spellStart"/>
+      <w:r>
+        <w:rPr>
+          <w:rFonts w:ascii="Times New Roman" w:hAnsi="Times New Roman" w:cs="Times New Roman"/>
+        </w:rPr>
+        <w:t>tasksUpdated</w:t>
+      </w:r>
+      <w:proofErr w:type="spellEnd"/>
+      <w:r>
+        <w:rPr>
+          <w:rFonts w:ascii="Times New Roman" w:hAnsi="Times New Roman" w:cs="Times New Roman"/>
+        </w:rPr>
+        <w:t xml:space="preserve">” event is triggered. Having done that, the fields are reset so that the user can enter new data, the table is refreshed to include the new task, and the summary is updated to include the correct numbers. </w:t>
       </w:r>
     </w:p>
     <w:p>
@@ -858,7 +1180,51 @@
           <w:rFonts w:ascii="Times New Roman" w:hAnsi="Times New Roman" w:cs="Times New Roman"/>
         </w:rPr>
         <w:tab/>
-        <w:t>The initial render part also calls the renderTasks() and updateSummary() functions to initialize the relevant elements.</w:t>
+        <w:t xml:space="preserve">The initial render part also calls the </w:t>
+      </w:r>
+      <w:proofErr w:type="spellStart"/>
+      <w:proofErr w:type="gramStart"/>
+      <w:r>
+        <w:rPr>
+          <w:rFonts w:ascii="Times New Roman" w:hAnsi="Times New Roman" w:cs="Times New Roman"/>
+        </w:rPr>
+        <w:t>renderTasks</w:t>
+      </w:r>
+      <w:proofErr w:type="spellEnd"/>
+      <w:r>
+        <w:rPr>
+          <w:rFonts w:ascii="Times New Roman" w:hAnsi="Times New Roman" w:cs="Times New Roman"/>
+        </w:rPr>
+        <w:t>(</w:t>
+      </w:r>
+      <w:proofErr w:type="gramEnd"/>
+      <w:r>
+        <w:rPr>
+          <w:rFonts w:ascii="Times New Roman" w:hAnsi="Times New Roman" w:cs="Times New Roman"/>
+        </w:rPr>
+        <w:t xml:space="preserve">) and </w:t>
+      </w:r>
+      <w:proofErr w:type="spellStart"/>
+      <w:proofErr w:type="gramStart"/>
+      <w:r>
+        <w:rPr>
+          <w:rFonts w:ascii="Times New Roman" w:hAnsi="Times New Roman" w:cs="Times New Roman"/>
+        </w:rPr>
+        <w:t>updateSummary</w:t>
+      </w:r>
+      <w:proofErr w:type="spellEnd"/>
+      <w:r>
+        <w:rPr>
+          <w:rFonts w:ascii="Times New Roman" w:hAnsi="Times New Roman" w:cs="Times New Roman"/>
+        </w:rPr>
+        <w:t>(</w:t>
+      </w:r>
+      <w:proofErr w:type="gramEnd"/>
+      <w:r>
+        <w:rPr>
+          <w:rFonts w:ascii="Times New Roman" w:hAnsi="Times New Roman" w:cs="Times New Roman"/>
+        </w:rPr>
+        <w:t>) functions to initialize the relevant elements.</w:t>
       </w:r>
     </w:p>
     <w:p>
@@ -896,7 +1262,35 @@
           <w:rFonts w:ascii="Times New Roman" w:hAnsi="Times New Roman" w:cs="Times New Roman"/>
         </w:rPr>
         <w:tab/>
-        <w:t xml:space="preserve">The style.css contains the css code related to the entire website, but in this section we will focus on the parts related to the tasks page. We begin with the form, summary and task table sections. There, </w:t>
+        <w:t xml:space="preserve">The style.css contains the </w:t>
+      </w:r>
+      <w:proofErr w:type="spellStart"/>
+      <w:r>
+        <w:rPr>
+          <w:rFonts w:ascii="Times New Roman" w:hAnsi="Times New Roman" w:cs="Times New Roman"/>
+        </w:rPr>
+        <w:t>css</w:t>
+      </w:r>
+      <w:proofErr w:type="spellEnd"/>
+      <w:r>
+        <w:rPr>
+          <w:rFonts w:ascii="Times New Roman" w:hAnsi="Times New Roman" w:cs="Times New Roman"/>
+        </w:rPr>
+        <w:t xml:space="preserve"> code related to the entire website, but in this </w:t>
+      </w:r>
+      <w:proofErr w:type="gramStart"/>
+      <w:r>
+        <w:rPr>
+          <w:rFonts w:ascii="Times New Roman" w:hAnsi="Times New Roman" w:cs="Times New Roman"/>
+        </w:rPr>
+        <w:t>section</w:t>
+      </w:r>
+      <w:proofErr w:type="gramEnd"/>
+      <w:r>
+        <w:rPr>
+          <w:rFonts w:ascii="Times New Roman" w:hAnsi="Times New Roman" w:cs="Times New Roman"/>
+        </w:rPr>
+        <w:t xml:space="preserve"> we will focus on the parts related to the tasks page. We begin with the form, summary and task table sections. There, </w:t>
       </w:r>
       <w:r>
         <w:rPr>
@@ -935,7 +1329,21 @@
         <w:rPr>
           <w:rFonts w:ascii="Times New Roman" w:hAnsi="Times New Roman" w:cs="Times New Roman"/>
         </w:rPr>
-        <w:t>For the latest activity tracking, a suitable container is first created in the index.html. Then, this list is targeted by a querySelector found in recentActivity.js and populated. In order for it to be populated, every time an activity takes place, a relevant entry is created in the local storage, as was shown in the “Tasks” section of the report. Thus, these entries are read, and each activity is rendered as an item o</w:t>
+        <w:t xml:space="preserve">For the latest activity tracking, a suitable container is first created in the index.html. Then, this list is targeted by a </w:t>
+      </w:r>
+      <w:proofErr w:type="spellStart"/>
+      <w:r>
+        <w:rPr>
+          <w:rFonts w:ascii="Times New Roman" w:hAnsi="Times New Roman" w:cs="Times New Roman"/>
+        </w:rPr>
+        <w:t>querySelector</w:t>
+      </w:r>
+      <w:proofErr w:type="spellEnd"/>
+      <w:r>
+        <w:rPr>
+          <w:rFonts w:ascii="Times New Roman" w:hAnsi="Times New Roman" w:cs="Times New Roman"/>
+        </w:rPr>
+        <w:t xml:space="preserve"> found in recentActivity.js and populated. In order for it to be populated, every time an activity takes place, a relevant entry is created in the local storage, as was shown in the “Tasks” section of the report. Thus, these entries are read, and each activity is rendered as an item o</w:t>
       </w:r>
       <w:r>
         <w:rPr>
@@ -949,11 +1357,19 @@
         </w:rPr>
         <w:t xml:space="preserve"> the list. It is worth mentioning that the “</w:t>
       </w:r>
-      <w:r>
-        <w:rPr>
-          <w:rFonts w:ascii="Times New Roman" w:hAnsi="Times New Roman" w:cs="Times New Roman"/>
-        </w:rPr>
-        <w:t>activityList.prepend(li);</w:t>
+      <w:proofErr w:type="spellStart"/>
+      <w:r>
+        <w:rPr>
+          <w:rFonts w:ascii="Times New Roman" w:hAnsi="Times New Roman" w:cs="Times New Roman"/>
+        </w:rPr>
+        <w:t>activityList.prepend</w:t>
+      </w:r>
+      <w:proofErr w:type="spellEnd"/>
+      <w:r>
+        <w:rPr>
+          <w:rFonts w:ascii="Times New Roman" w:hAnsi="Times New Roman" w:cs="Times New Roman"/>
+        </w:rPr>
+        <w:t>(li);</w:t>
       </w:r>
       <w:r>
         <w:rPr>
@@ -1008,7 +1424,21 @@
         <w:rPr>
           <w:rFonts w:ascii="Times New Roman" w:hAnsi="Times New Roman" w:cs="Times New Roman"/>
         </w:rPr>
-        <w:t xml:space="preserve">For the first extra component, I decided to implement the Frequently Asked Question boxes as an accordion (when a question is clicked, its answer is shown/hidden). To do that, I start by selecting all the elements with the “faq-question” class, looping through each one of them, and adding a “click” event to each one. Then, I get the corresponding answer for each element, and hide all other answers. The way this is done is by looping through the answers, and hiding the </w:t>
+        <w:t>For the first extra component, I decided to implement the Frequently Asked Question boxes as an accordion (when a question is clicked, its answer is shown/hidden). To do that, I start by selecting all the elements with the “</w:t>
+      </w:r>
+      <w:proofErr w:type="spellStart"/>
+      <w:r>
+        <w:rPr>
+          <w:rFonts w:ascii="Times New Roman" w:hAnsi="Times New Roman" w:cs="Times New Roman"/>
+        </w:rPr>
+        <w:t>faq</w:t>
+      </w:r>
+      <w:proofErr w:type="spellEnd"/>
+      <w:r>
+        <w:rPr>
+          <w:rFonts w:ascii="Times New Roman" w:hAnsi="Times New Roman" w:cs="Times New Roman"/>
+        </w:rPr>
+        <w:t xml:space="preserve">-question” class, looping through each one of them, and adding a “click” event to each one. Then, I get the corresponding answer for each element, and hide all other answers. The way this is done is by looping through the answers, and hiding the </w:t>
       </w:r>
       <w:r>
         <w:rPr>
@@ -1048,7 +1478,21 @@
         <w:rPr>
           <w:rFonts w:ascii="Times New Roman" w:hAnsi="Times New Roman" w:cs="Times New Roman"/>
         </w:rPr>
-        <w:t>If the two strings are the same, then we are on the same day, the previous count is loaded from local storage, converted into a number, and the counting continues. It should be noted that the “|| 0” is used for cases where there is no faqVisitors variable in the local storage. If the day has changed, then the count is reset to 0, and then incremented. Lastly, the updated values are saved and the UI is updated as well.</w:t>
+        <w:t xml:space="preserve">If the two strings are the same, then we are on the same day, the previous count is loaded from local storage, converted into a number, and the counting continues. It should be noted that the “|| 0” is used for cases where there is no </w:t>
+      </w:r>
+      <w:proofErr w:type="spellStart"/>
+      <w:r>
+        <w:rPr>
+          <w:rFonts w:ascii="Times New Roman" w:hAnsi="Times New Roman" w:cs="Times New Roman"/>
+        </w:rPr>
+        <w:t>faqVisitors</w:t>
+      </w:r>
+      <w:proofErr w:type="spellEnd"/>
+      <w:r>
+        <w:rPr>
+          <w:rFonts w:ascii="Times New Roman" w:hAnsi="Times New Roman" w:cs="Times New Roman"/>
+        </w:rPr>
+        <w:t xml:space="preserve"> variable in the local storage. If the day has changed, then the count is reset to 0, and then incremented. Lastly, the updated values are saved and the UI is updated as well.</w:t>
       </w:r>
     </w:p>
     <w:p>
@@ -1075,13 +1519,55 @@
         <w:rPr>
           <w:rFonts w:ascii="Times New Roman" w:hAnsi="Times New Roman" w:cs="Times New Roman"/>
         </w:rPr>
-        <w:t xml:space="preserve"> It starts by grabbing all faq-like class buttons, then it loops through each button</w:t>
-      </w:r>
-      <w:r>
-        <w:rPr>
-          <w:rFonts w:ascii="Times New Roman" w:hAnsi="Times New Roman" w:cs="Times New Roman"/>
-        </w:rPr>
-        <w:t xml:space="preserve">, finds the button’s FAQ parent by going up the DOM tree and gets the faq id by reading the equivalent HTML part (&lt;div class = “faq-item” data-id = “faq1”&gt;). Then, it gets the counter display element, by finding the span with the “like-count” class. Afterwards, it loads the saved likes from local storage by searching for a unique key like “faq-like-faq1”, and displays the current count. After that part, comes the button click behavior. Once a “Helpful” button is clicked, the count is increased, the UI is updated, a unique key is created (the one used to load the saved likes as mentioned above) and the new count value is stored in local storage. </w:t>
+        <w:t xml:space="preserve"> It starts by grabbing all </w:t>
+      </w:r>
+      <w:proofErr w:type="spellStart"/>
+      <w:r>
+        <w:rPr>
+          <w:rFonts w:ascii="Times New Roman" w:hAnsi="Times New Roman" w:cs="Times New Roman"/>
+        </w:rPr>
+        <w:t>faq</w:t>
+      </w:r>
+      <w:proofErr w:type="spellEnd"/>
+      <w:r>
+        <w:rPr>
+          <w:rFonts w:ascii="Times New Roman" w:hAnsi="Times New Roman" w:cs="Times New Roman"/>
+        </w:rPr>
+        <w:t>-like class buttons, then it loops through each button</w:t>
+      </w:r>
+      <w:r>
+        <w:rPr>
+          <w:rFonts w:ascii="Times New Roman" w:hAnsi="Times New Roman" w:cs="Times New Roman"/>
+        </w:rPr>
+        <w:t xml:space="preserve">, finds the button’s FAQ parent by going up the DOM tree and gets the </w:t>
+      </w:r>
+      <w:proofErr w:type="spellStart"/>
+      <w:r>
+        <w:rPr>
+          <w:rFonts w:ascii="Times New Roman" w:hAnsi="Times New Roman" w:cs="Times New Roman"/>
+        </w:rPr>
+        <w:t>faq</w:t>
+      </w:r>
+      <w:proofErr w:type="spellEnd"/>
+      <w:r>
+        <w:rPr>
+          <w:rFonts w:ascii="Times New Roman" w:hAnsi="Times New Roman" w:cs="Times New Roman"/>
+        </w:rPr>
+        <w:t xml:space="preserve"> id by reading the equivalent HTML part (&lt;div class = “</w:t>
+      </w:r>
+      <w:proofErr w:type="spellStart"/>
+      <w:r>
+        <w:rPr>
+          <w:rFonts w:ascii="Times New Roman" w:hAnsi="Times New Roman" w:cs="Times New Roman"/>
+        </w:rPr>
+        <w:t>faq</w:t>
+      </w:r>
+      <w:proofErr w:type="spellEnd"/>
+      <w:r>
+        <w:rPr>
+          <w:rFonts w:ascii="Times New Roman" w:hAnsi="Times New Roman" w:cs="Times New Roman"/>
+        </w:rPr>
+        <w:t xml:space="preserve">-item” data-id = “faq1”&gt;). Then, it gets the counter display element, by finding the span with the “like-count” class. Afterwards, it loads the saved likes from local storage by searching for a unique key like “faq-like-faq1”, and displays the current count. After that part, comes the button click behavior. Once a “Helpful” button is clicked, the count is increased, the UI is updated, a unique key is created (the one used to load the saved likes as mentioned above) and the new count value is stored in local storage. </w:t>
       </w:r>
     </w:p>
     <w:p>
@@ -1895,7 +2381,49 @@
         <w:rPr>
           <w:rFonts w:ascii="Times New Roman" w:hAnsi="Times New Roman" w:cs="Times New Roman"/>
         </w:rPr>
-        <w:t xml:space="preserve">the Cross-Origin Resource Sharing policy not allowing my script (which was running from a folder in my computer) to get the data it required using the fetch() function. My initial solution was to create mock data instead of taking it from the API server. Upon consulting with my peers however I found out that no one else had faced such an issue. Taking this into consideration I decided to carry out some more research into the topic, and discovered that the openweathermap API I used to get the data for my widget did allow for CORS. Knowing that, I deleted the part associating with data-generation, and replaced it once more with a fetch() function. </w:t>
+        <w:t xml:space="preserve">the Cross-Origin Resource Sharing policy not allowing my script (which was running from a folder in my computer) to get the data it required using the </w:t>
+      </w:r>
+      <w:proofErr w:type="gramStart"/>
+      <w:r>
+        <w:rPr>
+          <w:rFonts w:ascii="Times New Roman" w:hAnsi="Times New Roman" w:cs="Times New Roman"/>
+        </w:rPr>
+        <w:t>fetch(</w:t>
+      </w:r>
+      <w:proofErr w:type="gramEnd"/>
+      <w:r>
+        <w:rPr>
+          <w:rFonts w:ascii="Times New Roman" w:hAnsi="Times New Roman" w:cs="Times New Roman"/>
+        </w:rPr>
+        <w:t xml:space="preserve">) function. My initial solution was to create mock data instead of taking it from the API server. Upon consulting with my peers however I found out that no one else had faced such an issue. Taking this into consideration I decided to carry out some more research into the topic, and discovered that the </w:t>
+      </w:r>
+      <w:proofErr w:type="spellStart"/>
+      <w:r>
+        <w:rPr>
+          <w:rFonts w:ascii="Times New Roman" w:hAnsi="Times New Roman" w:cs="Times New Roman"/>
+        </w:rPr>
+        <w:t>openweathermap</w:t>
+      </w:r>
+      <w:proofErr w:type="spellEnd"/>
+      <w:r>
+        <w:rPr>
+          <w:rFonts w:ascii="Times New Roman" w:hAnsi="Times New Roman" w:cs="Times New Roman"/>
+        </w:rPr>
+        <w:t xml:space="preserve"> API I used to get the data for my widget did allow for CORS. Knowing that, I deleted the part associating with data-generation, and replaced it once more with a </w:t>
+      </w:r>
+      <w:proofErr w:type="gramStart"/>
+      <w:r>
+        <w:rPr>
+          <w:rFonts w:ascii="Times New Roman" w:hAnsi="Times New Roman" w:cs="Times New Roman"/>
+        </w:rPr>
+        <w:t>fetch(</w:t>
+      </w:r>
+      <w:proofErr w:type="gramEnd"/>
+      <w:r>
+        <w:rPr>
+          <w:rFonts w:ascii="Times New Roman" w:hAnsi="Times New Roman" w:cs="Times New Roman"/>
+        </w:rPr>
+        <w:t xml:space="preserve">) function. </w:t>
       </w:r>
       <w:r>
         <w:rPr>
@@ -1917,13 +2445,7 @@
         <w:rPr>
           <w:rFonts w:ascii="Times New Roman" w:hAnsi="Times New Roman" w:cs="Times New Roman"/>
         </w:rPr>
-        <w:t>In general, the site was built using techniques and knowledge covered in class. During the making of this exercise, I also made use of Google and ChatGPT, in order to find answers to questions, conduct troubleshooting, and take advice regarding various parts of the site.</w:t>
-      </w:r>
-      <w:r>
-        <w:rPr>
-          <w:rFonts w:ascii="Times New Roman" w:hAnsi="Times New Roman" w:cs="Times New Roman"/>
-        </w:rPr>
-        <w:t xml:space="preserve"> Combining these online resources with the slides provided by the professor helped me better understand the nuances and operation of HTML, CSS, and JavaScript.</w:t>
+        <w:t>In general, the site was built using techniques and knowledge covered in class. During the making of this exercise, I also made use of Google and ChatGPT, in order to find answers to questions, conduct troubleshooting, and take advice regarding various parts of the site. Combining these online resources with the slides provided by the professor helped me better understand the nuances and operation of HTML, CSS, and JavaScript.</w:t>
       </w:r>
     </w:p>
     <w:p>
@@ -1935,8 +2457,49 @@
         </w:rPr>
       </w:pPr>
     </w:p>
+    <w:p>
+      <w:pPr>
+        <w:ind w:firstLine="360"/>
+        <w:jc w:val="both"/>
+        <w:rPr>
+          <w:rFonts w:ascii="Times New Roman" w:hAnsi="Times New Roman" w:cs="Times New Roman"/>
+        </w:rPr>
+      </w:pPr>
+      <w:proofErr w:type="spellStart"/>
+      <w:r>
+        <w:rPr>
+          <w:rFonts w:ascii="Times New Roman" w:hAnsi="Times New Roman" w:cs="Times New Roman"/>
+        </w:rPr>
+        <w:t>Github</w:t>
+      </w:r>
+      <w:proofErr w:type="spellEnd"/>
+      <w:r>
+        <w:rPr>
+          <w:rFonts w:ascii="Times New Roman" w:hAnsi="Times New Roman" w:cs="Times New Roman"/>
+        </w:rPr>
+        <w:t xml:space="preserve"> link: </w:t>
+      </w:r>
+      <w:hyperlink r:id="rId13" w:history="1">
+        <w:r>
+          <w:rPr>
+            <w:rStyle w:val="Hyperlink"/>
+            <w:rFonts w:ascii="Times New Roman" w:hAnsi="Times New Roman" w:cs="Times New Roman"/>
+          </w:rPr>
+          <w:t>https://github.com/Dimant01/ITC4214_Midterm_Mantzaridis.git</w:t>
+        </w:r>
+      </w:hyperlink>
+    </w:p>
+    <w:p>
+      <w:pPr>
+        <w:ind w:firstLine="360"/>
+        <w:jc w:val="both"/>
+        <w:rPr>
+          <w:rFonts w:ascii="Times New Roman" w:hAnsi="Times New Roman" w:cs="Times New Roman"/>
+        </w:rPr>
+      </w:pPr>
+    </w:p>
     <w:sectPr>
-      <w:headerReference w:type="default" r:id="rId13"/>
+      <w:headerReference w:type="default" r:id="rId14"/>
       <w:pgSz w:w="12240" w:h="15840"/>
       <w:pgMar w:top="1440" w:right="1440" w:bottom="1440" w:left="1440" w:header="720" w:footer="720" w:gutter="0"/>
       <w:cols w:space="720"/>
@@ -3232,6 +3795,18 @@
       <w:szCs w:val="18"/>
     </w:rPr>
   </w:style>
+  <w:style w:type="character" w:styleId="UnresolvedMention">
+    <w:name w:val="Unresolved Mention"/>
+    <w:basedOn w:val="DefaultParagraphFont"/>
+    <w:uiPriority w:val="99"/>
+    <w:semiHidden/>
+    <w:unhideWhenUsed/>
+    <w:rsid w:val="007115FA"/>
+    <w:rPr>
+      <w:color w:val="605E5C"/>
+      <w:shd w:val="clear" w:color="auto" w:fill="E1DFDD"/>
+    </w:rPr>
+  </w:style>
 </w:styles>
 </file>
 

</xml_diff>